<commit_message>
Docs: manual de usuario con el dueño, las solicitudes, el equipo y el odontograma
</commit_message>
<xml_diff>
--- a/docs/para-drive/Manual de usuario.docx
+++ b/docs/para-drive/Manual de usuario.docx
@@ -338,7 +338,29 @@
         <w:t xml:space="preserve"> </w:t>
       </w:r>
       <w:r>
-        <w:t xml:space="preserve">(rol de administrador). Es la única persona que inicia sesión.</w:t>
+        <w:t xml:space="preserve">(rol de administrador). Inicia sesión para atender el panel.</w:t>
+      </w:r>
+    </w:p>
+    <w:p>
+      <w:pPr>
+        <w:numPr>
+          <w:ilvl w:val="0"/>
+          <w:numId w:val="1001"/>
+        </w:numPr>
+        <w:pStyle w:val="Compact"/>
+      </w:pPr>
+      <w:r>
+        <w:rPr>
+          <w:bCs/>
+          <w:b/>
+        </w:rPr>
+        <w:t xml:space="preserve">Dueño del consultorio</w:t>
+      </w:r>
+      <w:r>
+        <w:t xml:space="preserve"> </w:t>
+      </w:r>
+      <w:r>
+        <w:t xml:space="preserve">(rol superadmin). Tiene permiso total: ve y cambia todo, aprueba las correcciones a la historia clínica y administra al equipo.</w:t>
       </w:r>
     </w:p>
     <w:p>
@@ -356,7 +378,7 @@
         <w:t xml:space="preserve"> </w:t>
       </w:r>
       <w:r>
-        <w:t xml:space="preserve">pedir una cita, reprogramarla o cancelarla, los mensajes de WhatsApp que se reciben, y, para la secretaria, el panel con inicio, agenda, pacientes (con su historia clínica) y horarios de atención.</w:t>
+        <w:t xml:space="preserve">pedir una cita, reprogramarla o cancelarla, los mensajes de WhatsApp que se reciben; para la secretaria, el panel con inicio, agenda, pacientes (con su historia clínica y su odontograma) y horarios de atención; y para el dueño, además, las solicitudes por aprobar y el equipo de administradores.</w:t>
       </w:r>
     </w:p>
     <w:bookmarkEnd w:id="20"/>
@@ -759,13 +781,13 @@
       </w:r>
     </w:p>
     <w:bookmarkEnd w:id="29"/>
-    <w:bookmarkStart w:id="33" w:name="menú-del-panel-para-la-secretaria"/>
+    <w:bookmarkStart w:id="33" w:name="menú-del-panel-secretaria-y-dueño"/>
     <w:p>
       <w:pPr>
         <w:pStyle w:val="Heading2"/>
       </w:pPr>
       <w:r>
-        <w:t xml:space="preserve">4.2 Menú del panel (para la secretaria)</w:t>
+        <w:t xml:space="preserve">4.2 Menú del panel (secretaria y dueño)</w:t>
       </w:r>
     </w:p>
     <w:p>
@@ -936,6 +958,78 @@
           </w:p>
         </w:tc>
       </w:tr>
+      <w:tr>
+        <w:tc>
+          <w:tcPr/>
+          <w:p>
+            <w:pPr>
+              <w:pStyle w:val="Compact"/>
+              <w:jc w:val="left"/>
+            </w:pPr>
+            <w:r>
+              <w:rPr>
+                <w:bCs/>
+                <w:b/>
+              </w:rPr>
+              <w:t xml:space="preserve">Solicitudes</w:t>
+            </w:r>
+            <w:r>
+              <w:t xml:space="preserve"> </w:t>
+            </w:r>
+            <w:r>
+              <w:t xml:space="preserve">(solo el dueño)</w:t>
+            </w:r>
+          </w:p>
+        </w:tc>
+        <w:tc>
+          <w:tcPr/>
+          <w:p>
+            <w:pPr>
+              <w:pStyle w:val="Compact"/>
+              <w:jc w:val="left"/>
+            </w:pPr>
+            <w:r>
+              <w:t xml:space="preserve">Aprobar o rechazar las correcciones a la historia clínica y las anulaciones del odontograma que piden los administradores. Un número rojo indica cuántas hay.</w:t>
+            </w:r>
+          </w:p>
+        </w:tc>
+      </w:tr>
+      <w:tr>
+        <w:tc>
+          <w:tcPr/>
+          <w:p>
+            <w:pPr>
+              <w:pStyle w:val="Compact"/>
+              <w:jc w:val="left"/>
+            </w:pPr>
+            <w:r>
+              <w:rPr>
+                <w:bCs/>
+                <w:b/>
+              </w:rPr>
+              <w:t xml:space="preserve">Equipo</w:t>
+            </w:r>
+            <w:r>
+              <w:t xml:space="preserve"> </w:t>
+            </w:r>
+            <w:r>
+              <w:t xml:space="preserve">(solo el dueño)</w:t>
+            </w:r>
+          </w:p>
+        </w:tc>
+        <w:tc>
+          <w:tcPr/>
+          <w:p>
+            <w:pPr>
+              <w:pStyle w:val="Compact"/>
+              <w:jc w:val="left"/>
+            </w:pPr>
+            <w:r>
+              <w:t xml:space="preserve">Agregar, editar, desactivar y eliminar administradores.</w:t>
+            </w:r>
+          </w:p>
+        </w:tc>
+      </w:tr>
     </w:tbl>
     <w:p>
       <w:pPr>
@@ -1015,7 +1109,7 @@
     </w:p>
     <w:bookmarkEnd w:id="33"/>
     <w:bookmarkEnd w:id="34"/>
-    <w:bookmarkStart w:id="102" w:name="funciones-principales"/>
+    <w:bookmarkStart w:id="123" w:name="funciones-principales"/>
     <w:p>
       <w:pPr>
         <w:pStyle w:val="Heading1"/>
@@ -2424,7 +2518,7 @@
       </w:r>
     </w:p>
     <w:bookmarkEnd w:id="70"/>
-    <w:bookmarkStart w:id="80" w:name="X1590f34bf3572d4f8cb4a3d53373c9f72a6ba0b"/>
+    <w:bookmarkStart w:id="83" w:name="X1590f34bf3572d4f8cb4a3d53373c9f72a6ba0b"/>
     <w:p>
       <w:pPr>
         <w:pStyle w:val="Heading2"/>
@@ -2807,7 +2901,29 @@
         <w:t xml:space="preserve"> </w:t>
       </w:r>
       <w:r>
-        <w:t xml:space="preserve">la deja ligada a esa cita. Una entrada no se borra:</w:t>
+        <w:t xml:space="preserve">la deja ligada a esa cita. Las entradas nuevas no necesitan aprobación.</w:t>
+      </w:r>
+    </w:p>
+    <w:p>
+      <w:pPr>
+        <w:numPr>
+          <w:ilvl w:val="0"/>
+          <w:numId w:val="1011"/>
+        </w:numPr>
+        <w:pStyle w:val="Compact"/>
+      </w:pPr>
+      <w:r>
+        <w:rPr>
+          <w:bCs/>
+          <w:b/>
+        </w:rPr>
+        <w:t xml:space="preserve">Corregir una entrada:</w:t>
+      </w:r>
+      <w:r>
+        <w:t xml:space="preserve"> </w:t>
+      </w:r>
+      <w:r>
+        <w:t xml:space="preserve">una entrada no se borra ni se edita.</w:t>
       </w:r>
       <w:r>
         <w:t xml:space="preserve"> </w:t>
@@ -2823,25 +2939,52 @@
         <w:t xml:space="preserve"> </w:t>
       </w:r>
       <w:r>
-        <w:t xml:space="preserve">la marca como corregida y guarda la corrección como una entrada nueva, para que quede el registro.</w:t>
-      </w:r>
-    </w:p>
-    <w:bookmarkEnd w:id="80"/>
-    <w:bookmarkStart w:id="90" w:name="horarios-de-atención-secretaria"/>
-    <w:p>
-      <w:pPr>
-        <w:pStyle w:val="Heading2"/>
-      </w:pPr>
-      <w:r>
-        <w:t xml:space="preserve">5.8 Horarios de atención (secretaria)</w:t>
-      </w:r>
-    </w:p>
-    <w:p>
-      <w:pPr>
-        <w:pStyle w:val="FirstParagraph"/>
-      </w:pPr>
-      <w:r>
-        <w:t xml:space="preserve">Aquí se publican las horas en que cada especialista recibe pacientes. Solo esas horas aparecen disponibles en la web.</w:t>
+        <w:t xml:space="preserve">guarda la corrección como una entrada nueva. Si la hace la secretaria, se envía con</w:t>
+      </w:r>
+      <w:r>
+        <w:t xml:space="preserve"> </w:t>
+      </w:r>
+      <w:r>
+        <w:rPr>
+          <w:bCs/>
+          <w:b/>
+        </w:rPr>
+        <w:t xml:space="preserve">Enviar para aprobación</w:t>
+      </w:r>
+      <w:r>
+        <w:t xml:space="preserve"> </w:t>
+      </w:r>
+      <w:r>
+        <w:t xml:space="preserve">y queda</w:t>
+      </w:r>
+      <w:r>
+        <w:t xml:space="preserve"> </w:t>
+      </w:r>
+      <w:r>
+        <w:rPr>
+          <w:bCs/>
+          <w:b/>
+        </w:rPr>
+        <w:t xml:space="preserve">«Esperando aprobación del dueño»</w:t>
+      </w:r>
+      <w:r>
+        <w:t xml:space="preserve">: la entrada original sigue vigente hasta que el dueño la apruebe. Si el dueño la rechaza, la corrección queda marcada como</w:t>
+      </w:r>
+      <w:r>
+        <w:t xml:space="preserve"> </w:t>
+      </w:r>
+      <w:r>
+        <w:rPr>
+          <w:bCs/>
+          <w:b/>
+        </w:rPr>
+        <w:t xml:space="preserve">«Corrección rechazada»</w:t>
+      </w:r>
+      <w:r>
+        <w:t xml:space="preserve"> </w:t>
+      </w:r>
+      <w:r>
+        <w:t xml:space="preserve">con su motivo. Las correcciones del dueño quedan aprobadas de una vez.</w:t>
       </w:r>
     </w:p>
     <w:p>
@@ -2851,20 +2994,524 @@
       <w:r>
         <w:drawing>
           <wp:inline>
-            <wp:extent cx="5067300" cy="3250197"/>
+            <wp:extent cx="4800600" cy="2418906"/>
             <wp:effectExtent b="0" l="0" r="0" t="0"/>
-            <wp:docPr descr="Horarios: semana de un especialista." title="" id="82" name="Picture"/>
+            <wp:docPr descr="Corrección esperando la aprobación del dueño." title="" id="81" name="Picture"/>
             <a:graphic>
               <a:graphicData uri="http://schemas.openxmlformats.org/drawingml/2006/picture">
                 <pic:pic>
                   <pic:nvPicPr>
-                    <pic:cNvPr descr="../capturas/manual/s10-horarios.png" id="83" name="Picture"/>
+                    <pic:cNvPr descr="../capturas/manual/s21-correccion-pendiente.png" id="82" name="Picture"/>
                     <pic:cNvPicPr>
                       <a:picLocks noChangeArrowheads="1" noChangeAspect="1"/>
                     </pic:cNvPicPr>
                   </pic:nvPicPr>
                   <pic:blipFill>
-                    <a:blip r:embed="rId81"/>
+                    <a:blip r:embed="rId80"/>
+                    <a:stretch>
+                      <a:fillRect/>
+                    </a:stretch>
+                  </pic:blipFill>
+                  <pic:spPr bwMode="auto">
+                    <a:xfrm>
+                      <a:off x="0" y="0"/>
+                      <a:ext cx="4800600" cy="2418906"/>
+                    </a:xfrm>
+                    <a:prstGeom prst="rect">
+                      <a:avLst/>
+                    </a:prstGeom>
+                    <a:noFill/>
+                    <a:ln w="9525">
+                      <a:noFill/>
+                      <a:headEnd/>
+                      <a:tailEnd/>
+                    </a:ln>
+                  </pic:spPr>
+                </pic:pic>
+              </a:graphicData>
+            </a:graphic>
+          </wp:inline>
+        </w:drawing>
+      </w:r>
+    </w:p>
+    <w:p>
+      <w:pPr>
+        <w:pStyle w:val="ImageCaption"/>
+      </w:pPr>
+      <w:r>
+        <w:t xml:space="preserve">Corrección esperando la aprobación del dueño.</w:t>
+      </w:r>
+    </w:p>
+    <w:bookmarkEnd w:id="83"/>
+    <w:bookmarkStart w:id="90" w:name="odontograma-secretaria-y-dueño"/>
+    <w:p>
+      <w:pPr>
+        <w:pStyle w:val="Heading2"/>
+      </w:pPr>
+      <w:r>
+        <w:t xml:space="preserve">5.8 Odontograma (secretaria y dueño)</w:t>
+      </w:r>
+    </w:p>
+    <w:p>
+      <w:pPr>
+        <w:pStyle w:val="FirstParagraph"/>
+      </w:pPr>
+      <w:r>
+        <w:t xml:space="preserve">En la ficha del paciente, el</w:t>
+      </w:r>
+      <w:r>
+        <w:t xml:space="preserve"> </w:t>
+      </w:r>
+      <w:r>
+        <w:rPr>
+          <w:bCs/>
+          <w:b/>
+        </w:rPr>
+        <w:t xml:space="preserve">odontograma</w:t>
+      </w:r>
+      <w:r>
+        <w:t xml:space="preserve"> </w:t>
+      </w:r>
+      <w:r>
+        <w:t xml:space="preserve">muestra la boca como una dentadura: arriba los dientes superiores y abajo los inferiores, con la numeración internacional (FDI). El lado derecho del paciente queda a la izquierda de la pantalla, como cuando se le mira de frente. Con</w:t>
+      </w:r>
+      <w:r>
+        <w:t xml:space="preserve"> </w:t>
+      </w:r>
+      <w:r>
+        <w:rPr>
+          <w:bCs/>
+          <w:b/>
+        </w:rPr>
+        <w:t xml:space="preserve">Adulto (32)</w:t>
+      </w:r>
+      <w:r>
+        <w:t xml:space="preserve"> </w:t>
+      </w:r>
+      <w:r>
+        <w:t xml:space="preserve">y</w:t>
+      </w:r>
+      <w:r>
+        <w:t xml:space="preserve"> </w:t>
+      </w:r>
+      <w:r>
+        <w:rPr>
+          <w:bCs/>
+          <w:b/>
+        </w:rPr>
+        <w:t xml:space="preserve">Niño (20)</w:t>
+      </w:r>
+      <w:r>
+        <w:t xml:space="preserve"> </w:t>
+      </w:r>
+      <w:r>
+        <w:t xml:space="preserve">se cambia entre dientes permanentes y de leche.</w:t>
+      </w:r>
+    </w:p>
+    <w:p>
+      <w:pPr>
+        <w:pStyle w:val="BodyText"/>
+      </w:pPr>
+      <w:r>
+        <w:t xml:space="preserve">Cada diente tiene su figura y un cuadro con sus 5 caras: oclusal (centro), mesial, distal, vestibular y lingual o palatina. Los colores siguen la convención clínica:</w:t>
+      </w:r>
+    </w:p>
+    <w:p>
+      <w:pPr>
+        <w:numPr>
+          <w:ilvl w:val="0"/>
+          <w:numId w:val="1012"/>
+        </w:numPr>
+        <w:pStyle w:val="Compact"/>
+      </w:pPr>
+      <w:r>
+        <w:rPr>
+          <w:bCs/>
+          <w:b/>
+        </w:rPr>
+        <w:t xml:space="preserve">Rojo:</w:t>
+      </w:r>
+      <w:r>
+        <w:t xml:space="preserve"> </w:t>
+      </w:r>
+      <w:r>
+        <w:t xml:space="preserve">por hacer (por ejemplo, una caries que hay que tratar).</w:t>
+      </w:r>
+    </w:p>
+    <w:p>
+      <w:pPr>
+        <w:numPr>
+          <w:ilvl w:val="0"/>
+          <w:numId w:val="1012"/>
+        </w:numPr>
+        <w:pStyle w:val="Compact"/>
+      </w:pPr>
+      <w:r>
+        <w:rPr>
+          <w:bCs/>
+          <w:b/>
+        </w:rPr>
+        <w:t xml:space="preserve">Azul:</w:t>
+      </w:r>
+      <w:r>
+        <w:t xml:space="preserve"> </w:t>
+      </w:r>
+      <w:r>
+        <w:t xml:space="preserve">realizado o existente (por ejemplo, una resina ya hecha).</w:t>
+      </w:r>
+    </w:p>
+    <w:p>
+      <w:pPr>
+        <w:numPr>
+          <w:ilvl w:val="0"/>
+          <w:numId w:val="1012"/>
+        </w:numPr>
+        <w:pStyle w:val="Compact"/>
+      </w:pPr>
+      <w:r>
+        <w:t xml:space="preserve">Las letras sobre el diente indican hallazgos del diente completo (CO corona, EN endodoncia, EX extracción, AU ausente, IM implante, PR prótesis, FR fractura, OT otro). Un diente ausente o extraído aparece con una X.</w:t>
+      </w:r>
+    </w:p>
+    <w:p>
+      <w:pPr>
+        <w:numPr>
+          <w:ilvl w:val="0"/>
+          <w:numId w:val="1012"/>
+        </w:numPr>
+        <w:pStyle w:val="Compact"/>
+      </w:pPr>
+      <w:r>
+        <w:t xml:space="preserve">Un punto naranja indica que ese diente tiene una anulación esperando la aprobación del dueño.</w:t>
+      </w:r>
+    </w:p>
+    <w:p>
+      <w:pPr>
+        <w:pStyle w:val="FirstParagraph"/>
+      </w:pPr>
+      <w:r>
+        <w:t xml:space="preserve">Debajo aparece la lista</w:t>
+      </w:r>
+      <w:r>
+        <w:t xml:space="preserve"> </w:t>
+      </w:r>
+      <w:r>
+        <w:rPr>
+          <w:bCs/>
+          <w:b/>
+        </w:rPr>
+        <w:t xml:space="preserve">Por hacer</w:t>
+      </w:r>
+      <w:r>
+        <w:t xml:space="preserve">: el plan de tratamiento pendiente. Al tocar una línea se abre el diente.</w:t>
+      </w:r>
+    </w:p>
+    <w:p>
+      <w:pPr>
+        <w:pStyle w:val="CaptionedFigure"/>
+      </w:pPr>
+      <w:r>
+        <w:drawing>
+          <wp:inline>
+            <wp:extent cx="5067300" cy="3987061"/>
+            <wp:effectExtent b="0" l="0" r="0" t="0"/>
+            <wp:docPr descr="Odontograma en la ficha del paciente." title="" id="85" name="Picture"/>
+            <a:graphic>
+              <a:graphicData uri="http://schemas.openxmlformats.org/drawingml/2006/picture">
+                <pic:pic>
+                  <pic:nvPicPr>
+                    <pic:cNvPr descr="../capturas/manual/s16-odontograma.png" id="86" name="Picture"/>
+                    <pic:cNvPicPr>
+                      <a:picLocks noChangeArrowheads="1" noChangeAspect="1"/>
+                    </pic:cNvPicPr>
+                  </pic:nvPicPr>
+                  <pic:blipFill>
+                    <a:blip r:embed="rId84"/>
+                    <a:stretch>
+                      <a:fillRect/>
+                    </a:stretch>
+                  </pic:blipFill>
+                  <pic:spPr bwMode="auto">
+                    <a:xfrm>
+                      <a:off x="0" y="0"/>
+                      <a:ext cx="5067300" cy="3987061"/>
+                    </a:xfrm>
+                    <a:prstGeom prst="rect">
+                      <a:avLst/>
+                    </a:prstGeom>
+                    <a:noFill/>
+                    <a:ln w="9525">
+                      <a:noFill/>
+                      <a:headEnd/>
+                      <a:tailEnd/>
+                    </a:ln>
+                  </pic:spPr>
+                </pic:pic>
+              </a:graphicData>
+            </a:graphic>
+          </wp:inline>
+        </w:drawing>
+      </w:r>
+    </w:p>
+    <w:p>
+      <w:pPr>
+        <w:pStyle w:val="ImageCaption"/>
+      </w:pPr>
+      <w:r>
+        <w:t xml:space="preserve">Odontograma en la ficha del paciente.</w:t>
+      </w:r>
+    </w:p>
+    <w:p>
+      <w:pPr>
+        <w:pStyle w:val="BodyText"/>
+      </w:pPr>
+      <w:r>
+        <w:rPr>
+          <w:bCs/>
+          <w:b/>
+        </w:rPr>
+        <w:t xml:space="preserve">Registrar un hallazgo:</w:t>
+      </w:r>
+    </w:p>
+    <w:p>
+      <w:pPr>
+        <w:numPr>
+          <w:ilvl w:val="0"/>
+          <w:numId w:val="1013"/>
+        </w:numPr>
+        <w:pStyle w:val="Compact"/>
+      </w:pPr>
+      <w:r>
+        <w:t xml:space="preserve">Toque el diente.</w:t>
+      </w:r>
+    </w:p>
+    <w:p>
+      <w:pPr>
+        <w:numPr>
+          <w:ilvl w:val="0"/>
+          <w:numId w:val="1013"/>
+        </w:numPr>
+        <w:pStyle w:val="Compact"/>
+      </w:pPr>
+      <w:r>
+        <w:t xml:space="preserve">Elija qué se encontró o qué se hizo (caries, resina, corona, endodoncia, etc.).</w:t>
+      </w:r>
+    </w:p>
+    <w:p>
+      <w:pPr>
+        <w:numPr>
+          <w:ilvl w:val="0"/>
+          <w:numId w:val="1013"/>
+        </w:numPr>
+        <w:pStyle w:val="Compact"/>
+      </w:pPr>
+      <w:r>
+        <w:t xml:space="preserve">Marque las caras tocando el dibujo o las casillas. Algunos hallazgos van por caras (caries, resina, amalgama, sellante) y otros en el diente completo (corona, endodoncia, extracción, ausente, implante, prótesis); el sistema marca solo lo que corresponde.</w:t>
+      </w:r>
+    </w:p>
+    <w:p>
+      <w:pPr>
+        <w:numPr>
+          <w:ilvl w:val="0"/>
+          <w:numId w:val="1013"/>
+        </w:numPr>
+        <w:pStyle w:val="Compact"/>
+      </w:pPr>
+      <w:r>
+        <w:t xml:space="preserve">Elija</w:t>
+      </w:r>
+      <w:r>
+        <w:t xml:space="preserve"> </w:t>
+      </w:r>
+      <w:r>
+        <w:rPr>
+          <w:bCs/>
+          <w:b/>
+        </w:rPr>
+        <w:t xml:space="preserve">Por hacer</w:t>
+      </w:r>
+      <w:r>
+        <w:t xml:space="preserve"> </w:t>
+      </w:r>
+      <w:r>
+        <w:t xml:space="preserve">o</w:t>
+      </w:r>
+      <w:r>
+        <w:t xml:space="preserve"> </w:t>
+      </w:r>
+      <w:r>
+        <w:rPr>
+          <w:bCs/>
+          <w:b/>
+        </w:rPr>
+        <w:t xml:space="preserve">Realizado</w:t>
+      </w:r>
+      <w:r>
+        <w:t xml:space="preserve">, agregue notas si hace falta y toque</w:t>
+      </w:r>
+      <w:r>
+        <w:t xml:space="preserve"> </w:t>
+      </w:r>
+      <w:r>
+        <w:rPr>
+          <w:bCs/>
+          <w:b/>
+        </w:rPr>
+        <w:t xml:space="preserve">Guardar hallazgo</w:t>
+      </w:r>
+      <w:r>
+        <w:t xml:space="preserve">.</w:t>
+      </w:r>
+    </w:p>
+    <w:p>
+      <w:pPr>
+        <w:pStyle w:val="CaptionedFigure"/>
+      </w:pPr>
+      <w:r>
+        <w:drawing>
+          <wp:inline>
+            <wp:extent cx="4800600" cy="3375421"/>
+            <wp:effectExtent b="0" l="0" r="0" t="0"/>
+            <wp:docPr descr="Detalle de un diente: hallazgos registrados y formulario." title="" id="88" name="Picture"/>
+            <a:graphic>
+              <a:graphicData uri="http://schemas.openxmlformats.org/drawingml/2006/picture">
+                <pic:pic>
+                  <pic:nvPicPr>
+                    <pic:cNvPr descr="../capturas/manual/s17-diente.png" id="89" name="Picture"/>
+                    <pic:cNvPicPr>
+                      <a:picLocks noChangeArrowheads="1" noChangeAspect="1"/>
+                    </pic:cNvPicPr>
+                  </pic:nvPicPr>
+                  <pic:blipFill>
+                    <a:blip r:embed="rId87"/>
+                    <a:stretch>
+                      <a:fillRect/>
+                    </a:stretch>
+                  </pic:blipFill>
+                  <pic:spPr bwMode="auto">
+                    <a:xfrm>
+                      <a:off x="0" y="0"/>
+                      <a:ext cx="4800600" cy="3375421"/>
+                    </a:xfrm>
+                    <a:prstGeom prst="rect">
+                      <a:avLst/>
+                    </a:prstGeom>
+                    <a:noFill/>
+                    <a:ln w="9525">
+                      <a:noFill/>
+                      <a:headEnd/>
+                      <a:tailEnd/>
+                    </a:ln>
+                  </pic:spPr>
+                </pic:pic>
+              </a:graphicData>
+            </a:graphic>
+          </wp:inline>
+        </w:drawing>
+      </w:r>
+    </w:p>
+    <w:p>
+      <w:pPr>
+        <w:pStyle w:val="ImageCaption"/>
+      </w:pPr>
+      <w:r>
+        <w:t xml:space="preserve">Detalle de un diente: hallazgos registrados y formulario.</w:t>
+      </w:r>
+    </w:p>
+    <w:p>
+      <w:pPr>
+        <w:pStyle w:val="BodyText"/>
+      </w:pPr>
+      <w:r>
+        <w:t xml:space="preserve">En el mismo detalle, cada hallazgo</w:t>
+      </w:r>
+      <w:r>
+        <w:t xml:space="preserve"> </w:t>
+      </w:r>
+      <w:r>
+        <w:rPr>
+          <w:bCs/>
+          <w:b/>
+        </w:rPr>
+        <w:t xml:space="preserve">por hacer</w:t>
+      </w:r>
+      <w:r>
+        <w:t xml:space="preserve"> </w:t>
+      </w:r>
+      <w:r>
+        <w:t xml:space="preserve">tiene</w:t>
+      </w:r>
+      <w:r>
+        <w:t xml:space="preserve"> </w:t>
+      </w:r>
+      <w:r>
+        <w:rPr>
+          <w:bCs/>
+          <w:b/>
+        </w:rPr>
+        <w:t xml:space="preserve">Marcar realizado</w:t>
+      </w:r>
+      <w:r>
+        <w:t xml:space="preserve"> </w:t>
+      </w:r>
+      <w:r>
+        <w:t xml:space="preserve">(queda quién y cuándo). Si un hallazgo se registró por error,</w:t>
+      </w:r>
+      <w:r>
+        <w:t xml:space="preserve"> </w:t>
+      </w:r>
+      <w:r>
+        <w:rPr>
+          <w:bCs/>
+          <w:b/>
+        </w:rPr>
+        <w:t xml:space="preserve">Anular</w:t>
+      </w:r>
+      <w:r>
+        <w:t xml:space="preserve"> </w:t>
+      </w:r>
+      <w:r>
+        <w:t xml:space="preserve">pide la anulación con un motivo: el hallazgo sigue en el odontograma hasta que el dueño la apruebe. Nada se borra: los anulados quedan en el historial del diente.</w:t>
+      </w:r>
+    </w:p>
+    <w:bookmarkEnd w:id="90"/>
+    <w:bookmarkStart w:id="100" w:name="horarios-de-atención-secretaria"/>
+    <w:p>
+      <w:pPr>
+        <w:pStyle w:val="Heading2"/>
+      </w:pPr>
+      <w:r>
+        <w:t xml:space="preserve">5.9 Horarios de atención (secretaria)</w:t>
+      </w:r>
+    </w:p>
+    <w:p>
+      <w:pPr>
+        <w:pStyle w:val="FirstParagraph"/>
+      </w:pPr>
+      <w:r>
+        <w:t xml:space="preserve">Aquí se publican las horas en que cada especialista recibe pacientes. Solo esas horas aparecen disponibles en la web.</w:t>
+      </w:r>
+    </w:p>
+    <w:p>
+      <w:pPr>
+        <w:pStyle w:val="CaptionedFigure"/>
+      </w:pPr>
+      <w:r>
+        <w:drawing>
+          <wp:inline>
+            <wp:extent cx="5067300" cy="3250197"/>
+            <wp:effectExtent b="0" l="0" r="0" t="0"/>
+            <wp:docPr descr="Horarios: semana de un especialista." title="" id="92" name="Picture"/>
+            <a:graphic>
+              <a:graphicData uri="http://schemas.openxmlformats.org/drawingml/2006/picture">
+                <pic:pic>
+                  <pic:nvPicPr>
+                    <pic:cNvPr descr="../capturas/manual/s10-horarios.png" id="93" name="Picture"/>
+                    <pic:cNvPicPr>
+                      <a:picLocks noChangeArrowheads="1" noChangeAspect="1"/>
+                    </pic:cNvPicPr>
+                  </pic:nvPicPr>
+                  <pic:blipFill>
+                    <a:blip r:embed="rId91"/>
                     <a:stretch>
                       <a:fillRect/>
                     </a:stretch>
@@ -2903,7 +3550,7 @@
       <w:pPr>
         <w:numPr>
           <w:ilvl w:val="0"/>
-          <w:numId w:val="1012"/>
+          <w:numId w:val="1014"/>
         </w:numPr>
         <w:pStyle w:val="Compact"/>
       </w:pPr>
@@ -2928,7 +3575,7 @@
       <w:pPr>
         <w:numPr>
           <w:ilvl w:val="0"/>
-          <w:numId w:val="1012"/>
+          <w:numId w:val="1014"/>
         </w:numPr>
         <w:pStyle w:val="Compact"/>
       </w:pPr>
@@ -2953,7 +3600,7 @@
       <w:pPr>
         <w:numPr>
           <w:ilvl w:val="0"/>
-          <w:numId w:val="1012"/>
+          <w:numId w:val="1014"/>
         </w:numPr>
         <w:pStyle w:val="Compact"/>
       </w:pPr>
@@ -2986,18 +3633,18 @@
           <wp:inline>
             <wp:extent cx="4267200" cy="2667000"/>
             <wp:effectExtent b="0" l="0" r="0" t="0"/>
-            <wp:docPr descr="Editar el horario de un día." title="" id="85" name="Picture"/>
+            <wp:docPr descr="Editar el horario de un día." title="" id="95" name="Picture"/>
             <a:graphic>
               <a:graphicData uri="http://schemas.openxmlformats.org/drawingml/2006/picture">
                 <pic:pic>
                   <pic:nvPicPr>
-                    <pic:cNvPr descr="../capturas/manual/s11-horarios-editar.png" id="86" name="Picture"/>
+                    <pic:cNvPr descr="../capturas/manual/s11-horarios-editar.png" id="96" name="Picture"/>
                     <pic:cNvPicPr>
                       <a:picLocks noChangeArrowheads="1" noChangeAspect="1"/>
                     </pic:cNvPicPr>
                   </pic:nvPicPr>
                   <pic:blipFill>
-                    <a:blip r:embed="rId84"/>
+                    <a:blip r:embed="rId94"/>
                     <a:stretch>
                       <a:fillRect/>
                     </a:stretch>
@@ -3036,7 +3683,7 @@
       <w:pPr>
         <w:numPr>
           <w:ilvl w:val="0"/>
-          <w:numId w:val="1013"/>
+          <w:numId w:val="1015"/>
         </w:numPr>
         <w:pStyle w:val="Compact"/>
       </w:pPr>
@@ -3103,7 +3750,7 @@
       <w:pPr>
         <w:numPr>
           <w:ilvl w:val="0"/>
-          <w:numId w:val="1013"/>
+          <w:numId w:val="1015"/>
         </w:numPr>
         <w:pStyle w:val="Compact"/>
       </w:pPr>
@@ -3133,18 +3780,18 @@
           <wp:inline>
             <wp:extent cx="4267200" cy="2667000"/>
             <wp:effectExtent b="0" l="0" r="0" t="0"/>
-            <wp:docPr descr="Copiar el horario a otros días y semanas." title="" id="88" name="Picture"/>
+            <wp:docPr descr="Copiar el horario a otros días y semanas." title="" id="98" name="Picture"/>
             <a:graphic>
               <a:graphicData uri="http://schemas.openxmlformats.org/drawingml/2006/picture">
                 <pic:pic>
                   <pic:nvPicPr>
-                    <pic:cNvPr descr="../capturas/manual/s12-horarios-copiar.png" id="89" name="Picture"/>
+                    <pic:cNvPr descr="../capturas/manual/s12-horarios-copiar.png" id="99" name="Picture"/>
                     <pic:cNvPicPr>
                       <a:picLocks noChangeArrowheads="1" noChangeAspect="1"/>
                     </pic:cNvPicPr>
                   </pic:nvPicPr>
                   <pic:blipFill>
-                    <a:blip r:embed="rId87"/>
+                    <a:blip r:embed="rId97"/>
                     <a:stretch>
                       <a:fillRect/>
                     </a:stretch>
@@ -3183,7 +3830,7 @@
       <w:pPr>
         <w:numPr>
           <w:ilvl w:val="0"/>
-          <w:numId w:val="1014"/>
+          <w:numId w:val="1016"/>
         </w:numPr>
         <w:pStyle w:val="Compact"/>
       </w:pPr>
@@ -3212,21 +3859,21 @@
         <w:t xml:space="preserve">Las horas que ya tienen cita aparecen con el nombre del paciente y no se pueden quitar; las que ya pasaron tampoco se cambian. Para mover una cita hay que reprogramarla desde la agenda.</w:t>
       </w:r>
     </w:p>
-    <w:bookmarkEnd w:id="90"/>
-    <w:bookmarkStart w:id="100" w:name="configuración-de-preferencias"/>
+    <w:bookmarkEnd w:id="100"/>
+    <w:bookmarkStart w:id="110" w:name="configuración-de-preferencias"/>
     <w:p>
       <w:pPr>
         <w:pStyle w:val="Heading2"/>
       </w:pPr>
       <w:r>
-        <w:t xml:space="preserve">5.9 Configuración de preferencias</w:t>
+        <w:t xml:space="preserve">5.10 Configuración de preferencias</w:t>
       </w:r>
     </w:p>
     <w:p>
       <w:pPr>
         <w:numPr>
           <w:ilvl w:val="0"/>
-          <w:numId w:val="1015"/>
+          <w:numId w:val="1017"/>
         </w:numPr>
         <w:pStyle w:val="Compact"/>
       </w:pPr>
@@ -3253,18 +3900,18 @@
           <wp:inline>
             <wp:extent cx="2400300" cy="1248156"/>
             <wp:effectExtent b="0" l="0" r="0" t="0"/>
-            <wp:docPr descr="Menú de la cuenta." title="" id="92" name="Picture"/>
+            <wp:docPr descr="Menú de la cuenta." title="" id="102" name="Picture"/>
             <a:graphic>
               <a:graphicData uri="http://schemas.openxmlformats.org/drawingml/2006/picture">
                 <pic:pic>
                   <pic:nvPicPr>
-                    <pic:cNvPr descr="../capturas/manual/s04-menu-cuenta.png" id="93" name="Picture"/>
+                    <pic:cNvPr descr="../capturas/manual/s04-menu-cuenta.png" id="103" name="Picture"/>
                     <pic:cNvPicPr>
                       <a:picLocks noChangeArrowheads="1" noChangeAspect="1"/>
                     </pic:cNvPicPr>
                   </pic:nvPicPr>
                   <pic:blipFill>
-                    <a:blip r:embed="rId91"/>
+                    <a:blip r:embed="rId101"/>
                     <a:stretch>
                       <a:fillRect/>
                     </a:stretch>
@@ -3308,18 +3955,18 @@
           <wp:inline>
             <wp:extent cx="4800600" cy="3000375"/>
             <wp:effectExtent b="0" l="0" r="0" t="0"/>
-            <wp:docPr descr="Panel en modo oscuro." title="" id="95" name="Picture"/>
+            <wp:docPr descr="Panel en modo oscuro." title="" id="105" name="Picture"/>
             <a:graphic>
               <a:graphicData uri="http://schemas.openxmlformats.org/drawingml/2006/picture">
                 <pic:pic>
                   <pic:nvPicPr>
-                    <pic:cNvPr descr="../capturas/manual/s14-modo-oscuro.png" id="96" name="Picture"/>
+                    <pic:cNvPr descr="../capturas/manual/s14-modo-oscuro.png" id="106" name="Picture"/>
                     <pic:cNvPicPr>
                       <a:picLocks noChangeArrowheads="1" noChangeAspect="1"/>
                     </pic:cNvPicPr>
                   </pic:nvPicPr>
                   <pic:blipFill>
-                    <a:blip r:embed="rId94"/>
+                    <a:blip r:embed="rId104"/>
                     <a:stretch>
                       <a:fillRect/>
                     </a:stretch>
@@ -3358,7 +4005,7 @@
       <w:pPr>
         <w:numPr>
           <w:ilvl w:val="0"/>
-          <w:numId w:val="1016"/>
+          <w:numId w:val="1018"/>
         </w:numPr>
         <w:pStyle w:val="Compact"/>
       </w:pPr>
@@ -3385,18 +4032,18 @@
           <wp:inline>
             <wp:extent cx="1866900" cy="4040163"/>
             <wp:effectExtent b="0" l="0" r="0" t="0"/>
-            <wp:docPr descr="Panel en el celular." title="" id="98" name="Picture"/>
+            <wp:docPr descr="Panel en el celular." title="" id="108" name="Picture"/>
             <a:graphic>
               <a:graphicData uri="http://schemas.openxmlformats.org/drawingml/2006/picture">
                 <pic:pic>
                   <pic:nvPicPr>
-                    <pic:cNvPr descr="../capturas/manual/s15-movil.png" id="99" name="Picture"/>
+                    <pic:cNvPr descr="../capturas/manual/s15-movil.png" id="109" name="Picture"/>
                     <pic:cNvPicPr>
                       <a:picLocks noChangeArrowheads="1" noChangeAspect="1"/>
                     </pic:cNvPicPr>
                   </pic:nvPicPr>
                   <pic:blipFill>
-                    <a:blip r:embed="rId97"/>
+                    <a:blip r:embed="rId107"/>
                     <a:stretch>
                       <a:fillRect/>
                     </a:stretch>
@@ -3431,14 +4078,14 @@
         <w:t xml:space="preserve">Panel en el celular.</w:t>
       </w:r>
     </w:p>
-    <w:bookmarkEnd w:id="100"/>
-    <w:bookmarkStart w:id="101" w:name="especialidades-y-especialistas"/>
+    <w:bookmarkEnd w:id="110"/>
+    <w:bookmarkStart w:id="114" w:name="solicitudes-dueño"/>
     <w:p>
       <w:pPr>
         <w:pStyle w:val="Heading2"/>
       </w:pPr>
       <w:r>
-        <w:t xml:space="preserve">5.10 Especialidades y especialistas</w:t>
+        <w:t xml:space="preserve">5.11 Solicitudes (dueño)</w:t>
       </w:r>
     </w:p>
     <w:p>
@@ -3446,144 +4093,96 @@
         <w:pStyle w:val="FirstParagraph"/>
       </w:pPr>
       <w:r>
-        <w:t xml:space="preserve">En esta versión las especialidades y los especialistas</w:t>
-      </w:r>
-      <w:r>
-        <w:t xml:space="preserve"> </w:t>
-      </w:r>
-      <w:r>
-        <w:rPr>
-          <w:bCs/>
-          <w:b/>
-        </w:rPr>
-        <w:t xml:space="preserve">los configura el equipo técnico</w:t>
-      </w:r>
-      <w:r>
-        <w:t xml:space="preserve"> </w:t>
-      </w:r>
-      <w:r>
-        <w:t xml:space="preserve">al poner el sistema en marcha o cuando el consultorio lo pida (por ejemplo, para agregar un nuevo especialista o cambiar la descripción de una especialidad). El panel de la secretaria solo administra citas, pacientes y horarios. Una pantalla para que el consultorio los edite por sí mismo está prevista para una versión posterior.</w:t>
-      </w:r>
-    </w:p>
-    <w:bookmarkEnd w:id="101"/>
-    <w:bookmarkEnd w:id="102"/>
-    <w:bookmarkStart w:id="106" w:name="gestión-de-usuarios"/>
-    <w:p>
-      <w:pPr>
-        <w:pStyle w:val="Heading1"/>
-      </w:pPr>
-      <w:r>
-        <w:t xml:space="preserve">6. Gestión de usuarios</w:t>
-      </w:r>
-    </w:p>
-    <w:p>
-      <w:pPr>
-        <w:pStyle w:val="FirstParagraph"/>
-      </w:pPr>
-      <w:r>
-        <w:rPr>
-          <w:bCs/>
-          <w:b/>
-        </w:rPr>
-        <w:t xml:space="preserve">Crear cuenta o perfil.</w:t>
-      </w:r>
-      <w:r>
-        <w:t xml:space="preserve"> </w:t>
-      </w:r>
-      <w:r>
-        <w:t xml:space="preserve">Los pacientes no tienen cuenta ni perfil: sus datos quedan guardados en su ficha cuando piden o reciben una cita. La cuenta de la secretaria la crea el equipo técnico.</w:t>
-      </w:r>
-    </w:p>
-    <w:p>
-      <w:pPr>
-        <w:pStyle w:val="BodyText"/>
-      </w:pPr>
-      <w:r>
-        <w:rPr>
-          <w:bCs/>
-          <w:b/>
-        </w:rPr>
-        <w:t xml:space="preserve">Primer ingreso (secretaria).</w:t>
-      </w:r>
-      <w:r>
-        <w:t xml:space="preserve"> </w:t>
-      </w:r>
-      <w:r>
-        <w:t xml:space="preserve">Con la contraseña temporal, el sistema abre la pantalla «Crea tu contraseña»: escriba la temporal como contraseña actual y elija una propia. Sin ese paso no se puede entrar al panel.</w:t>
-      </w:r>
-    </w:p>
-    <w:p>
-      <w:pPr>
-        <w:pStyle w:val="BodyText"/>
-      </w:pPr>
-      <w:r>
-        <w:rPr>
-          <w:bCs/>
-          <w:b/>
-        </w:rPr>
-        <w:t xml:space="preserve">Cambiar la contraseña (secretaria).</w:t>
+        <w:t xml:space="preserve">En</w:t>
+      </w:r>
+      <w:r>
+        <w:t xml:space="preserve"> </w:t>
+      </w:r>
+      <w:r>
+        <w:rPr>
+          <w:bCs/>
+          <w:b/>
+        </w:rPr>
+        <w:t xml:space="preserve">Solicitudes</w:t>
+      </w:r>
+      <w:r>
+        <w:t xml:space="preserve"> </w:t>
+      </w:r>
+      <w:r>
+        <w:t xml:space="preserve">el dueño ve lo que pidieron los administradores y aún no está aprobado:</w:t>
       </w:r>
     </w:p>
     <w:p>
       <w:pPr>
         <w:numPr>
           <w:ilvl w:val="0"/>
-          <w:numId w:val="1017"/>
+          <w:numId w:val="1019"/>
         </w:numPr>
         <w:pStyle w:val="Compact"/>
       </w:pPr>
       <w:r>
-        <w:t xml:space="preserve">En el menú de la cuenta toque</w:t>
-      </w:r>
-      <w:r>
-        <w:t xml:space="preserve"> </w:t>
-      </w:r>
-      <w:r>
-        <w:rPr>
-          <w:bCs/>
-          <w:b/>
-        </w:rPr>
-        <w:t xml:space="preserve">Cambiar contraseña</w:t>
-      </w:r>
-      <w:r>
-        <w:t xml:space="preserve">.</w:t>
+        <w:rPr>
+          <w:bCs/>
+          <w:b/>
+        </w:rPr>
+        <w:t xml:space="preserve">Correcciones de la historia clínica:</w:t>
+      </w:r>
+      <w:r>
+        <w:t xml:space="preserve"> </w:t>
+      </w:r>
+      <w:r>
+        <w:t xml:space="preserve">cada tarjeta muestra el paciente, quién la pidió y cuándo, la</w:t>
+      </w:r>
+      <w:r>
+        <w:t xml:space="preserve"> </w:t>
+      </w:r>
+      <w:r>
+        <w:rPr>
+          <w:bCs/>
+          <w:b/>
+        </w:rPr>
+        <w:t xml:space="preserve">entrada original</w:t>
+      </w:r>
+      <w:r>
+        <w:t xml:space="preserve"> </w:t>
+      </w:r>
+      <w:r>
+        <w:t xml:space="preserve">y la</w:t>
+      </w:r>
+      <w:r>
+        <w:t xml:space="preserve"> </w:t>
+      </w:r>
+      <w:r>
+        <w:rPr>
+          <w:bCs/>
+          <w:b/>
+        </w:rPr>
+        <w:t xml:space="preserve">corrección pedida</w:t>
+      </w:r>
+      <w:r>
+        <w:t xml:space="preserve">, una al lado de la otra.</w:t>
       </w:r>
     </w:p>
     <w:p>
       <w:pPr>
         <w:numPr>
           <w:ilvl w:val="0"/>
-          <w:numId w:val="1017"/>
+          <w:numId w:val="1019"/>
         </w:numPr>
         <w:pStyle w:val="Compact"/>
       </w:pPr>
       <w:r>
-        <w:t xml:space="preserve">Escriba la contraseña actual y la nueva dos veces.</w:t>
-      </w:r>
-    </w:p>
-    <w:p>
-      <w:pPr>
-        <w:numPr>
-          <w:ilvl w:val="0"/>
-          <w:numId w:val="1017"/>
-        </w:numPr>
-        <w:pStyle w:val="Compact"/>
-      </w:pPr>
-      <w:r>
-        <w:t xml:space="preserve">Toque</w:t>
-      </w:r>
-      <w:r>
-        <w:t xml:space="preserve"> </w:t>
-      </w:r>
-      <w:r>
-        <w:rPr>
-          <w:bCs/>
-          <w:b/>
-        </w:rPr>
-        <w:t xml:space="preserve">Guardar contraseña</w:t>
-      </w:r>
-      <w:r>
-        <w:t xml:space="preserve">.</w:t>
+        <w:rPr>
+          <w:bCs/>
+          <w:b/>
+        </w:rPr>
+        <w:t xml:space="preserve">Anulaciones del odontograma:</w:t>
+      </w:r>
+      <w:r>
+        <w:t xml:space="preserve"> </w:t>
+      </w:r>
+      <w:r>
+        <w:t xml:space="preserve">el diente, la cara, el hallazgo y el motivo para anularlo.</w:t>
       </w:r>
     </w:p>
     <w:p>
@@ -3591,7 +4190,33 @@
         <w:pStyle w:val="FirstParagraph"/>
       </w:pPr>
       <w:r>
-        <w:t xml:space="preserve">La contraseña nueva debe tener entre 8 y 72 caracteres, con al menos una letra y un número.</w:t>
+        <w:rPr>
+          <w:bCs/>
+          <w:b/>
+        </w:rPr>
+        <w:t xml:space="preserve">Aprobar</w:t>
+      </w:r>
+      <w:r>
+        <w:t xml:space="preserve"> </w:t>
+      </w:r>
+      <w:r>
+        <w:t xml:space="preserve">aplica el cambio: la corrección pasa a la historia (la original queda «Corregida») o el hallazgo deja de dibujarse.</w:t>
+      </w:r>
+      <w:r>
+        <w:t xml:space="preserve"> </w:t>
+      </w:r>
+      <w:r>
+        <w:rPr>
+          <w:bCs/>
+          <w:b/>
+        </w:rPr>
+        <w:t xml:space="preserve">Rechazar</w:t>
+      </w:r>
+      <w:r>
+        <w:t xml:space="preserve"> </w:t>
+      </w:r>
+      <w:r>
+        <w:t xml:space="preserve">pide un motivo; el cambio no se aplica y el motivo queda registrado. El nombre del paciente abre su ficha.</w:t>
       </w:r>
     </w:p>
     <w:p>
@@ -3601,20 +4226,649 @@
       <w:r>
         <w:drawing>
           <wp:inline>
-            <wp:extent cx="4267200" cy="2667000"/>
+            <wp:extent cx="4800600" cy="3634204"/>
             <wp:effectExtent b="0" l="0" r="0" t="0"/>
-            <wp:docPr descr="Cambiar contraseña." title="" id="104" name="Picture"/>
+            <wp:docPr descr="Solicitudes por aprobar." title="" id="112" name="Picture"/>
             <a:graphic>
               <a:graphicData uri="http://schemas.openxmlformats.org/drawingml/2006/picture">
                 <pic:pic>
                   <pic:nvPicPr>
-                    <pic:cNvPr descr="../capturas/manual/s13-cambiar-contrasena.png" id="105" name="Picture"/>
+                    <pic:cNvPr descr="../capturas/manual/s18-solicitudes.png" id="113" name="Picture"/>
                     <pic:cNvPicPr>
                       <a:picLocks noChangeArrowheads="1" noChangeAspect="1"/>
                     </pic:cNvPicPr>
                   </pic:nvPicPr>
                   <pic:blipFill>
-                    <a:blip r:embed="rId103"/>
+                    <a:blip r:embed="rId111"/>
+                    <a:stretch>
+                      <a:fillRect/>
+                    </a:stretch>
+                  </pic:blipFill>
+                  <pic:spPr bwMode="auto">
+                    <a:xfrm>
+                      <a:off x="0" y="0"/>
+                      <a:ext cx="4800600" cy="3634204"/>
+                    </a:xfrm>
+                    <a:prstGeom prst="rect">
+                      <a:avLst/>
+                    </a:prstGeom>
+                    <a:noFill/>
+                    <a:ln w="9525">
+                      <a:noFill/>
+                      <a:headEnd/>
+                      <a:tailEnd/>
+                    </a:ln>
+                  </pic:spPr>
+                </pic:pic>
+              </a:graphicData>
+            </a:graphic>
+          </wp:inline>
+        </w:drawing>
+      </w:r>
+    </w:p>
+    <w:p>
+      <w:pPr>
+        <w:pStyle w:val="ImageCaption"/>
+      </w:pPr>
+      <w:r>
+        <w:t xml:space="preserve">Solicitudes por aprobar.</w:t>
+      </w:r>
+    </w:p>
+    <w:bookmarkEnd w:id="114"/>
+    <w:bookmarkStart w:id="121" w:name="equipo-dueño"/>
+    <w:p>
+      <w:pPr>
+        <w:pStyle w:val="Heading2"/>
+      </w:pPr>
+      <w:r>
+        <w:t xml:space="preserve">5.12 Equipo (dueño)</w:t>
+      </w:r>
+    </w:p>
+    <w:p>
+      <w:pPr>
+        <w:pStyle w:val="FirstParagraph"/>
+      </w:pPr>
+      <w:r>
+        <w:t xml:space="preserve">En</w:t>
+      </w:r>
+      <w:r>
+        <w:t xml:space="preserve"> </w:t>
+      </w:r>
+      <w:r>
+        <w:rPr>
+          <w:bCs/>
+          <w:b/>
+        </w:rPr>
+        <w:t xml:space="preserve">Equipo</w:t>
+      </w:r>
+      <w:r>
+        <w:t xml:space="preserve"> </w:t>
+      </w:r>
+      <w:r>
+        <w:t xml:space="preserve">el dueño administra quién entra al panel.</w:t>
+      </w:r>
+    </w:p>
+    <w:p>
+      <w:pPr>
+        <w:pStyle w:val="CaptionedFigure"/>
+      </w:pPr>
+      <w:r>
+        <w:drawing>
+          <wp:inline>
+            <wp:extent cx="4800600" cy="3375421"/>
+            <wp:effectExtent b="0" l="0" r="0" t="0"/>
+            <wp:docPr descr="Equipo de administradores." title="" id="116" name="Picture"/>
+            <a:graphic>
+              <a:graphicData uri="http://schemas.openxmlformats.org/drawingml/2006/picture">
+                <pic:pic>
+                  <pic:nvPicPr>
+                    <pic:cNvPr descr="../capturas/manual/s19-equipo.png" id="117" name="Picture"/>
+                    <pic:cNvPicPr>
+                      <a:picLocks noChangeArrowheads="1" noChangeAspect="1"/>
+                    </pic:cNvPicPr>
+                  </pic:nvPicPr>
+                  <pic:blipFill>
+                    <a:blip r:embed="rId115"/>
+                    <a:stretch>
+                      <a:fillRect/>
+                    </a:stretch>
+                  </pic:blipFill>
+                  <pic:spPr bwMode="auto">
+                    <a:xfrm>
+                      <a:off x="0" y="0"/>
+                      <a:ext cx="4800600" cy="3375421"/>
+                    </a:xfrm>
+                    <a:prstGeom prst="rect">
+                      <a:avLst/>
+                    </a:prstGeom>
+                    <a:noFill/>
+                    <a:ln w="9525">
+                      <a:noFill/>
+                      <a:headEnd/>
+                      <a:tailEnd/>
+                    </a:ln>
+                  </pic:spPr>
+                </pic:pic>
+              </a:graphicData>
+            </a:graphic>
+          </wp:inline>
+        </w:drawing>
+      </w:r>
+    </w:p>
+    <w:p>
+      <w:pPr>
+        <w:pStyle w:val="ImageCaption"/>
+      </w:pPr>
+      <w:r>
+        <w:t xml:space="preserve">Equipo de administradores.</w:t>
+      </w:r>
+    </w:p>
+    <w:p>
+      <w:pPr>
+        <w:pStyle w:val="BodyText"/>
+      </w:pPr>
+      <w:r>
+        <w:rPr>
+          <w:bCs/>
+          <w:b/>
+        </w:rPr>
+        <w:t xml:space="preserve">Agregar un administrador:</w:t>
+      </w:r>
+    </w:p>
+    <w:p>
+      <w:pPr>
+        <w:numPr>
+          <w:ilvl w:val="0"/>
+          <w:numId w:val="1020"/>
+        </w:numPr>
+        <w:pStyle w:val="Compact"/>
+      </w:pPr>
+      <w:r>
+        <w:t xml:space="preserve">Toque</w:t>
+      </w:r>
+      <w:r>
+        <w:t xml:space="preserve"> </w:t>
+      </w:r>
+      <w:r>
+        <w:rPr>
+          <w:bCs/>
+          <w:b/>
+        </w:rPr>
+        <w:t xml:space="preserve">Agregar administrador</w:t>
+      </w:r>
+      <w:r>
+        <w:t xml:space="preserve">.</w:t>
+      </w:r>
+    </w:p>
+    <w:p>
+      <w:pPr>
+        <w:numPr>
+          <w:ilvl w:val="0"/>
+          <w:numId w:val="1020"/>
+        </w:numPr>
+        <w:pStyle w:val="Compact"/>
+      </w:pPr>
+      <w:r>
+        <w:t xml:space="preserve">Escriba nombre completo, documento, celular y correo (con ese correo ingresará).</w:t>
+      </w:r>
+    </w:p>
+    <w:p>
+      <w:pPr>
+        <w:numPr>
+          <w:ilvl w:val="0"/>
+          <w:numId w:val="1020"/>
+        </w:numPr>
+        <w:pStyle w:val="Compact"/>
+      </w:pPr>
+      <w:r>
+        <w:t xml:space="preserve">Toque</w:t>
+      </w:r>
+      <w:r>
+        <w:t xml:space="preserve"> </w:t>
+      </w:r>
+      <w:r>
+        <w:rPr>
+          <w:bCs/>
+          <w:b/>
+        </w:rPr>
+        <w:t xml:space="preserve">Agregar</w:t>
+      </w:r>
+      <w:r>
+        <w:t xml:space="preserve">. El sistema muestra una</w:t>
+      </w:r>
+      <w:r>
+        <w:t xml:space="preserve"> </w:t>
+      </w:r>
+      <w:r>
+        <w:rPr>
+          <w:bCs/>
+          <w:b/>
+        </w:rPr>
+        <w:t xml:space="preserve">contraseña temporal</w:t>
+      </w:r>
+      <w:r>
+        <w:t xml:space="preserve">: entréguela a la persona.</w:t>
+      </w:r>
+      <w:r>
+        <w:t xml:space="preserve"> </w:t>
+      </w:r>
+      <w:r>
+        <w:rPr>
+          <w:bCs/>
+          <w:b/>
+        </w:rPr>
+        <w:t xml:space="preserve">Solo se muestra esa vez</w:t>
+      </w:r>
+      <w:r>
+        <w:t xml:space="preserve"> </w:t>
+      </w:r>
+      <w:r>
+        <w:t xml:space="preserve">(con</w:t>
+      </w:r>
+      <w:r>
+        <w:t xml:space="preserve"> </w:t>
+      </w:r>
+      <w:r>
+        <w:rPr>
+          <w:bCs/>
+          <w:b/>
+        </w:rPr>
+        <w:t xml:space="preserve">Copiar clave</w:t>
+      </w:r>
+      <w:r>
+        <w:t xml:space="preserve"> </w:t>
+      </w:r>
+      <w:r>
+        <w:t xml:space="preserve">se copia).</w:t>
+      </w:r>
+    </w:p>
+    <w:p>
+      <w:pPr>
+        <w:numPr>
+          <w:ilvl w:val="0"/>
+          <w:numId w:val="1020"/>
+        </w:numPr>
+        <w:pStyle w:val="Compact"/>
+      </w:pPr>
+      <w:r>
+        <w:t xml:space="preserve">La primera vez que ingrese, el sistema le pedirá crear su propia contraseña.</w:t>
+      </w:r>
+    </w:p>
+    <w:p>
+      <w:pPr>
+        <w:pStyle w:val="CaptionedFigure"/>
+      </w:pPr>
+      <w:r>
+        <w:drawing>
+          <wp:inline>
+            <wp:extent cx="3200400" cy="2197608"/>
+            <wp:effectExtent b="0" l="0" r="0" t="0"/>
+            <wp:docPr descr="Contraseña temporal del administrador nuevo." title="" id="119" name="Picture"/>
+            <a:graphic>
+              <a:graphicData uri="http://schemas.openxmlformats.org/drawingml/2006/picture">
+                <pic:pic>
+                  <pic:nvPicPr>
+                    <pic:cNvPr descr="../capturas/manual/s20-clave-temporal.png" id="120" name="Picture"/>
+                    <pic:cNvPicPr>
+                      <a:picLocks noChangeArrowheads="1" noChangeAspect="1"/>
+                    </pic:cNvPicPr>
+                  </pic:nvPicPr>
+                  <pic:blipFill>
+                    <a:blip r:embed="rId118"/>
+                    <a:stretch>
+                      <a:fillRect/>
+                    </a:stretch>
+                  </pic:blipFill>
+                  <pic:spPr bwMode="auto">
+                    <a:xfrm>
+                      <a:off x="0" y="0"/>
+                      <a:ext cx="3200400" cy="2197608"/>
+                    </a:xfrm>
+                    <a:prstGeom prst="rect">
+                      <a:avLst/>
+                    </a:prstGeom>
+                    <a:noFill/>
+                    <a:ln w="9525">
+                      <a:noFill/>
+                      <a:headEnd/>
+                      <a:tailEnd/>
+                    </a:ln>
+                  </pic:spPr>
+                </pic:pic>
+              </a:graphicData>
+            </a:graphic>
+          </wp:inline>
+        </w:drawing>
+      </w:r>
+    </w:p>
+    <w:p>
+      <w:pPr>
+        <w:pStyle w:val="ImageCaption"/>
+      </w:pPr>
+      <w:r>
+        <w:t xml:space="preserve">Contraseña temporal del administrador nuevo.</w:t>
+      </w:r>
+    </w:p>
+    <w:p>
+      <w:pPr>
+        <w:pStyle w:val="BodyText"/>
+      </w:pPr>
+      <w:r>
+        <w:t xml:space="preserve">En</w:t>
+      </w:r>
+      <w:r>
+        <w:t xml:space="preserve"> </w:t>
+      </w:r>
+      <w:r>
+        <w:rPr>
+          <w:bCs/>
+          <w:b/>
+        </w:rPr>
+        <w:t xml:space="preserve">Opciones</w:t>
+      </w:r>
+      <w:r>
+        <w:t xml:space="preserve"> </w:t>
+      </w:r>
+      <w:r>
+        <w:t xml:space="preserve">de cada persona:</w:t>
+      </w:r>
+    </w:p>
+    <w:p>
+      <w:pPr>
+        <w:numPr>
+          <w:ilvl w:val="0"/>
+          <w:numId w:val="1021"/>
+        </w:numPr>
+        <w:pStyle w:val="Compact"/>
+      </w:pPr>
+      <w:r>
+        <w:rPr>
+          <w:bCs/>
+          <w:b/>
+        </w:rPr>
+        <w:t xml:space="preserve">Editar datos:</w:t>
+      </w:r>
+      <w:r>
+        <w:t xml:space="preserve"> </w:t>
+      </w:r>
+      <w:r>
+        <w:t xml:space="preserve">nombre, documento, celular o correo.</w:t>
+      </w:r>
+    </w:p>
+    <w:p>
+      <w:pPr>
+        <w:numPr>
+          <w:ilvl w:val="0"/>
+          <w:numId w:val="1021"/>
+        </w:numPr>
+        <w:pStyle w:val="Compact"/>
+      </w:pPr>
+      <w:r>
+        <w:rPr>
+          <w:bCs/>
+          <w:b/>
+        </w:rPr>
+        <w:t xml:space="preserve">Nueva clave temporal:</w:t>
+      </w:r>
+      <w:r>
+        <w:t xml:space="preserve"> </w:t>
+      </w:r>
+      <w:r>
+        <w:t xml:space="preserve">si olvidó su contraseña.</w:t>
+      </w:r>
+    </w:p>
+    <w:p>
+      <w:pPr>
+        <w:numPr>
+          <w:ilvl w:val="0"/>
+          <w:numId w:val="1021"/>
+        </w:numPr>
+        <w:pStyle w:val="Compact"/>
+      </w:pPr>
+      <w:r>
+        <w:rPr>
+          <w:bCs/>
+          <w:b/>
+        </w:rPr>
+        <w:t xml:space="preserve">Desactivar / Activar:</w:t>
+      </w:r>
+      <w:r>
+        <w:t xml:space="preserve"> </w:t>
+      </w:r>
+      <w:r>
+        <w:t xml:space="preserve">un administrador desactivado no puede ingresar y, si tenía el panel abierto, se le cierra de inmediato. Sus registros se conservan.</w:t>
+      </w:r>
+    </w:p>
+    <w:p>
+      <w:pPr>
+        <w:numPr>
+          <w:ilvl w:val="0"/>
+          <w:numId w:val="1021"/>
+        </w:numPr>
+        <w:pStyle w:val="Compact"/>
+      </w:pPr>
+      <w:r>
+        <w:rPr>
+          <w:bCs/>
+          <w:b/>
+        </w:rPr>
+        <w:t xml:space="preserve">Eliminar:</w:t>
+      </w:r>
+      <w:r>
+        <w:t xml:space="preserve"> </w:t>
+      </w:r>
+      <w:r>
+        <w:t xml:space="preserve">borra a la persona. Si ya registró pacientes, citas o historia clínica no se puede borrar (esos registros deben decir quién los hizo) y el sistema sugiere desactivarla.</w:t>
+      </w:r>
+    </w:p>
+    <w:p>
+      <w:pPr>
+        <w:pStyle w:val="FirstParagraph"/>
+      </w:pPr>
+      <w:r>
+        <w:t xml:space="preserve">La cuenta del dueño no aparece aquí: solo la crea o la modifica el equipo técnico.</w:t>
+      </w:r>
+    </w:p>
+    <w:bookmarkEnd w:id="121"/>
+    <w:bookmarkStart w:id="122" w:name="especialidades-y-especialistas"/>
+    <w:p>
+      <w:pPr>
+        <w:pStyle w:val="Heading2"/>
+      </w:pPr>
+      <w:r>
+        <w:t xml:space="preserve">5.13 Especialidades y especialistas</w:t>
+      </w:r>
+    </w:p>
+    <w:p>
+      <w:pPr>
+        <w:pStyle w:val="FirstParagraph"/>
+      </w:pPr>
+      <w:r>
+        <w:t xml:space="preserve">En esta versión las especialidades y los especialistas</w:t>
+      </w:r>
+      <w:r>
+        <w:t xml:space="preserve"> </w:t>
+      </w:r>
+      <w:r>
+        <w:rPr>
+          <w:bCs/>
+          <w:b/>
+        </w:rPr>
+        <w:t xml:space="preserve">los configura el equipo técnico</w:t>
+      </w:r>
+      <w:r>
+        <w:t xml:space="preserve"> </w:t>
+      </w:r>
+      <w:r>
+        <w:t xml:space="preserve">al poner el sistema en marcha o cuando el consultorio lo pida (por ejemplo, para agregar un nuevo especialista o cambiar la descripción de una especialidad). El panel de la secretaria solo administra citas, pacientes y horarios. Una pantalla para que el consultorio los edite por sí mismo está prevista para una versión posterior.</w:t>
+      </w:r>
+    </w:p>
+    <w:bookmarkEnd w:id="122"/>
+    <w:bookmarkEnd w:id="123"/>
+    <w:bookmarkStart w:id="127" w:name="gestión-de-usuarios"/>
+    <w:p>
+      <w:pPr>
+        <w:pStyle w:val="Heading1"/>
+      </w:pPr>
+      <w:r>
+        <w:t xml:space="preserve">6. Gestión de usuarios</w:t>
+      </w:r>
+    </w:p>
+    <w:p>
+      <w:pPr>
+        <w:pStyle w:val="FirstParagraph"/>
+      </w:pPr>
+      <w:r>
+        <w:rPr>
+          <w:bCs/>
+          <w:b/>
+        </w:rPr>
+        <w:t xml:space="preserve">Crear cuenta o perfil.</w:t>
+      </w:r>
+      <w:r>
+        <w:t xml:space="preserve"> </w:t>
+      </w:r>
+      <w:r>
+        <w:t xml:space="preserve">Los pacientes no tienen cuenta ni perfil: sus datos quedan guardados en su ficha cuando piden o reciben una cita. Las cuentas de los administradores las crea el dueño desde</w:t>
+      </w:r>
+      <w:r>
+        <w:t xml:space="preserve"> </w:t>
+      </w:r>
+      <w:r>
+        <w:rPr>
+          <w:bCs/>
+          <w:b/>
+        </w:rPr>
+        <w:t xml:space="preserve">Equipo</w:t>
+      </w:r>
+      <w:r>
+        <w:t xml:space="preserve"> </w:t>
+      </w:r>
+      <w:r>
+        <w:t xml:space="preserve">(sección 5.12); la cuenta del dueño la crea el equipo técnico con una clave especial y el correo del dueño.</w:t>
+      </w:r>
+    </w:p>
+    <w:p>
+      <w:pPr>
+        <w:pStyle w:val="BodyText"/>
+      </w:pPr>
+      <w:r>
+        <w:rPr>
+          <w:bCs/>
+          <w:b/>
+        </w:rPr>
+        <w:t xml:space="preserve">Primer ingreso (secretaria).</w:t>
+      </w:r>
+      <w:r>
+        <w:t xml:space="preserve"> </w:t>
+      </w:r>
+      <w:r>
+        <w:t xml:space="preserve">Con la contraseña temporal, el sistema abre la pantalla «Crea tu contraseña»: escriba la temporal como contraseña actual y elija una propia. Sin ese paso no se puede entrar al panel.</w:t>
+      </w:r>
+    </w:p>
+    <w:p>
+      <w:pPr>
+        <w:pStyle w:val="BodyText"/>
+      </w:pPr>
+      <w:r>
+        <w:rPr>
+          <w:bCs/>
+          <w:b/>
+        </w:rPr>
+        <w:t xml:space="preserve">Cambiar la contraseña (secretaria).</w:t>
+      </w:r>
+    </w:p>
+    <w:p>
+      <w:pPr>
+        <w:numPr>
+          <w:ilvl w:val="0"/>
+          <w:numId w:val="1022"/>
+        </w:numPr>
+        <w:pStyle w:val="Compact"/>
+      </w:pPr>
+      <w:r>
+        <w:t xml:space="preserve">En el menú de la cuenta toque</w:t>
+      </w:r>
+      <w:r>
+        <w:t xml:space="preserve"> </w:t>
+      </w:r>
+      <w:r>
+        <w:rPr>
+          <w:bCs/>
+          <w:b/>
+        </w:rPr>
+        <w:t xml:space="preserve">Cambiar contraseña</w:t>
+      </w:r>
+      <w:r>
+        <w:t xml:space="preserve">.</w:t>
+      </w:r>
+    </w:p>
+    <w:p>
+      <w:pPr>
+        <w:numPr>
+          <w:ilvl w:val="0"/>
+          <w:numId w:val="1022"/>
+        </w:numPr>
+        <w:pStyle w:val="Compact"/>
+      </w:pPr>
+      <w:r>
+        <w:t xml:space="preserve">Escriba la contraseña actual y la nueva dos veces.</w:t>
+      </w:r>
+    </w:p>
+    <w:p>
+      <w:pPr>
+        <w:numPr>
+          <w:ilvl w:val="0"/>
+          <w:numId w:val="1022"/>
+        </w:numPr>
+        <w:pStyle w:val="Compact"/>
+      </w:pPr>
+      <w:r>
+        <w:t xml:space="preserve">Toque</w:t>
+      </w:r>
+      <w:r>
+        <w:t xml:space="preserve"> </w:t>
+      </w:r>
+      <w:r>
+        <w:rPr>
+          <w:bCs/>
+          <w:b/>
+        </w:rPr>
+        <w:t xml:space="preserve">Guardar contraseña</w:t>
+      </w:r>
+      <w:r>
+        <w:t xml:space="preserve">.</w:t>
+      </w:r>
+    </w:p>
+    <w:p>
+      <w:pPr>
+        <w:pStyle w:val="FirstParagraph"/>
+      </w:pPr>
+      <w:r>
+        <w:t xml:space="preserve">La contraseña nueva debe tener entre 8 y 72 caracteres, con al menos una letra y un número.</w:t>
+      </w:r>
+    </w:p>
+    <w:p>
+      <w:pPr>
+        <w:pStyle w:val="CaptionedFigure"/>
+      </w:pPr>
+      <w:r>
+        <w:drawing>
+          <wp:inline>
+            <wp:extent cx="4267200" cy="2667000"/>
+            <wp:effectExtent b="0" l="0" r="0" t="0"/>
+            <wp:docPr descr="Cambiar contraseña." title="" id="125" name="Picture"/>
+            <a:graphic>
+              <a:graphicData uri="http://schemas.openxmlformats.org/drawingml/2006/picture">
+                <pic:pic>
+                  <pic:nvPicPr>
+                    <pic:cNvPr descr="../capturas/manual/s13-cambiar-contrasena.png" id="126" name="Picture"/>
+                    <pic:cNvPicPr>
+                      <a:picLocks noChangeArrowheads="1" noChangeAspect="1"/>
+                    </pic:cNvPicPr>
+                  </pic:nvPicPr>
+                  <pic:blipFill>
+                    <a:blip r:embed="rId124"/>
                     <a:stretch>
                       <a:fillRect/>
                     </a:stretch>
@@ -3654,7 +4908,23 @@
         <w:pStyle w:val="BodyText"/>
       </w:pPr>
       <w:r>
-        <w:t xml:space="preserve">Si olvidó la contraseña, no hay recuperación automática: avise al equipo técnico, que la restablece.</w:t>
+        <w:t xml:space="preserve">Si olvidó la contraseña, no hay recuperación automática: un administrador le pide al dueño una</w:t>
+      </w:r>
+      <w:r>
+        <w:t xml:space="preserve"> </w:t>
+      </w:r>
+      <w:r>
+        <w:rPr>
+          <w:bCs/>
+          <w:b/>
+        </w:rPr>
+        <w:t xml:space="preserve">Nueva clave temporal</w:t>
+      </w:r>
+      <w:r>
+        <w:t xml:space="preserve"> </w:t>
+      </w:r>
+      <w:r>
+        <w:t xml:space="preserve">(sección 5.12); el dueño se la pide al equipo técnico.</w:t>
       </w:r>
     </w:p>
     <w:p>
@@ -3813,14 +5083,94 @@
               <w:jc w:val="left"/>
             </w:pPr>
             <w:r>
-              <w:t xml:space="preserve">Todo el panel: agenda, pacientes e historia clínica, horarios, registrar pacientes y cambiar citas.</w:t>
+              <w:t xml:space="preserve">Agenda, pacientes, historia clínica y odontograma, horarios, registrar pacientes y cambiar citas. Sus correcciones a la historia y las anulaciones del odontograma esperan la aprobación del dueño.</w:t>
+            </w:r>
+          </w:p>
+        </w:tc>
+      </w:tr>
+      <w:tr>
+        <w:tc>
+          <w:tcPr/>
+          <w:p>
+            <w:pPr>
+              <w:pStyle w:val="Compact"/>
+              <w:jc w:val="left"/>
+            </w:pPr>
+            <w:r>
+              <w:rPr>
+                <w:bCs/>
+                <w:b/>
+              </w:rPr>
+              <w:t xml:space="preserve">Dueño</w:t>
+            </w:r>
+            <w:r>
+              <w:t xml:space="preserve"> </w:t>
+            </w:r>
+            <w:r>
+              <w:t xml:space="preserve">(superadmin)</w:t>
+            </w:r>
+          </w:p>
+        </w:tc>
+        <w:tc>
+          <w:tcPr/>
+          <w:p>
+            <w:pPr>
+              <w:pStyle w:val="Compact"/>
+              <w:jc w:val="left"/>
+            </w:pPr>
+            <w:r>
+              <w:t xml:space="preserve">Con su correo y contraseña, por el candado</w:t>
+            </w:r>
+          </w:p>
+        </w:tc>
+        <w:tc>
+          <w:tcPr/>
+          <w:p>
+            <w:pPr>
+              <w:pStyle w:val="Compact"/>
+              <w:jc w:val="left"/>
+            </w:pPr>
+            <w:r>
+              <w:t xml:space="preserve">Todo lo anterior, sin esperar aprobación, más</w:t>
+            </w:r>
+            <w:r>
+              <w:t xml:space="preserve"> </w:t>
+            </w:r>
+            <w:r>
+              <w:rPr>
+                <w:bCs/>
+                <w:b/>
+              </w:rPr>
+              <w:t xml:space="preserve">Solicitudes</w:t>
+            </w:r>
+            <w:r>
+              <w:t xml:space="preserve"> </w:t>
+            </w:r>
+            <w:r>
+              <w:t xml:space="preserve">(aprobar o rechazar cambios a la historia clínica) y</w:t>
+            </w:r>
+            <w:r>
+              <w:t xml:space="preserve"> </w:t>
+            </w:r>
+            <w:r>
+              <w:rPr>
+                <w:bCs/>
+                <w:b/>
+              </w:rPr>
+              <w:t xml:space="preserve">Equipo</w:t>
+            </w:r>
+            <w:r>
+              <w:t xml:space="preserve"> </w:t>
+            </w:r>
+            <w:r>
+              <w:t xml:space="preserve">(crear, editar, desactivar y eliminar administradores).</w:t>
             </w:r>
           </w:p>
         </w:tc>
       </w:tr>
     </w:tbl>
-    <w:bookmarkEnd w:id="106"/>
-    <w:bookmarkStart w:id="107" w:name="notificaciones-y-alertas"/>
+    <w:bookmarkEnd w:id="127"/>
+    <w:bookmarkStart w:id="128" w:name="notificaciones-y-alertas"/>
     <w:p>
       <w:pPr>
         <w:pStyle w:val="Heading1"/>
@@ -4159,8 +5509,8 @@
         <w:t xml:space="preserve">para quitarlo de la lista.</w:t>
       </w:r>
     </w:p>
-    <w:bookmarkEnd w:id="107"/>
-    <w:bookmarkStart w:id="108" w:name="solución-de-problemas-comunes"/>
+    <w:bookmarkEnd w:id="128"/>
+    <w:bookmarkStart w:id="129" w:name="solución-de-problemas-comunes"/>
     <w:p>
       <w:pPr>
         <w:pStyle w:val="Heading1"/>
@@ -4521,8 +5871,52 @@
         <w:t xml:space="preserve">reprograme o cancele primero la cita desde la agenda.</w:t>
       </w:r>
     </w:p>
-    <w:bookmarkEnd w:id="108"/>
-    <w:bookmarkStart w:id="109" w:name="glosario"/>
+    <w:p>
+      <w:pPr>
+        <w:pStyle w:val="BodyText"/>
+      </w:pPr>
+      <w:r>
+        <w:rPr>
+          <w:bCs/>
+          <w:b/>
+        </w:rPr>
+        <w:t xml:space="preserve">Problema 9: No me deja corregir una entrada de la historia.</w:t>
+      </w:r>
+      <w:r>
+        <w:br/>
+      </w:r>
+      <w:r>
+        <w:rPr>
+          <w:bCs/>
+          <w:b/>
+        </w:rPr>
+        <w:t xml:space="preserve">Causa:</w:t>
+      </w:r>
+      <w:r>
+        <w:t xml:space="preserve"> </w:t>
+      </w:r>
+      <w:r>
+        <w:t xml:space="preserve">ya tiene una corrección esperando la aprobación del dueño, o la entrada ya fue corregida.</w:t>
+      </w:r>
+      <w:r>
+        <w:br/>
+      </w:r>
+      <w:r>
+        <w:rPr>
+          <w:bCs/>
+          <w:b/>
+        </w:rPr>
+        <w:t xml:space="preserve">Solución:</w:t>
+      </w:r>
+      <w:r>
+        <w:t xml:space="preserve"> </w:t>
+      </w:r>
+      <w:r>
+        <w:t xml:space="preserve">espere a que el dueño revise la solicitud, o corrija la corrección más reciente.</w:t>
+      </w:r>
+    </w:p>
+    <w:bookmarkEnd w:id="129"/>
+    <w:bookmarkStart w:id="130" w:name="glosario"/>
     <w:p>
       <w:pPr>
         <w:pStyle w:val="Heading1"/>
@@ -4740,7 +6134,7 @@
         <w:t xml:space="preserve"> </w:t>
       </w:r>
       <w:r>
-        <w:t xml:space="preserve">notas que la secretaria agrega a la ficha después de las citas atendidas. No se borran: se corrigen dejando constancia.</w:t>
+        <w:t xml:space="preserve">notas que la secretaria agrega a la ficha después de las citas atendidas. No se borran: se corrigen dejando constancia, y las correcciones de la secretaria las aprueba el dueño.</w:t>
       </w:r>
     </w:p>
     <w:p>
@@ -4752,6 +6146,78 @@
           <w:bCs/>
           <w:b/>
         </w:rPr>
+        <w:t xml:space="preserve">Hallazgo:</w:t>
+      </w:r>
+      <w:r>
+        <w:t xml:space="preserve"> </w:t>
+      </w:r>
+      <w:r>
+        <w:t xml:space="preserve">lo que se encontró o se hizo en un diente o en una de sus caras (caries, resina, corona, etc.), por hacer o realizado.</w:t>
+      </w:r>
+    </w:p>
+    <w:p>
+      <w:pPr>
+        <w:pStyle w:val="BodyText"/>
+      </w:pPr>
+      <w:r>
+        <w:rPr>
+          <w:bCs/>
+          <w:b/>
+        </w:rPr>
+        <w:t xml:space="preserve">Odontograma:</w:t>
+      </w:r>
+      <w:r>
+        <w:t xml:space="preserve"> </w:t>
+      </w:r>
+      <w:r>
+        <w:t xml:space="preserve">dibujo de la boca del paciente donde se registran los hallazgos de cada diente.</w:t>
+      </w:r>
+    </w:p>
+    <w:p>
+      <w:pPr>
+        <w:pStyle w:val="BodyText"/>
+      </w:pPr>
+      <w:r>
+        <w:rPr>
+          <w:bCs/>
+          <w:b/>
+        </w:rPr>
+        <w:t xml:space="preserve">Solicitud:</w:t>
+      </w:r>
+      <w:r>
+        <w:t xml:space="preserve"> </w:t>
+      </w:r>
+      <w:r>
+        <w:t xml:space="preserve">cambio a la historia clínica (corrección o anulación) que pidió un administrador y espera la decisión del dueño.</w:t>
+      </w:r>
+    </w:p>
+    <w:p>
+      <w:pPr>
+        <w:pStyle w:val="BodyText"/>
+      </w:pPr>
+      <w:r>
+        <w:rPr>
+          <w:bCs/>
+          <w:b/>
+        </w:rPr>
+        <w:t xml:space="preserve">FDI:</w:t>
+      </w:r>
+      <w:r>
+        <w:t xml:space="preserve"> </w:t>
+      </w:r>
+      <w:r>
+        <w:t xml:space="preserve">numeración internacional de los dientes: el primer número es el cuadrante (1 a 4 permanentes, 5 a 8 de leche) y el segundo la pieza, contando desde el centro de la boca.</w:t>
+      </w:r>
+    </w:p>
+    <w:p>
+      <w:pPr>
+        <w:pStyle w:val="BodyText"/>
+      </w:pPr>
+      <w:r>
+        <w:rPr>
+          <w:bCs/>
+          <w:b/>
+        </w:rPr>
         <w:t xml:space="preserve">Horario (franja):</w:t>
       </w:r>
       <w:r>
@@ -4815,8 +6281,8 @@
         <w:t xml:space="preserve">aplicación de mensajería por la que el sistema envía los avisos.</w:t>
       </w:r>
     </w:p>
-    <w:bookmarkEnd w:id="109"/>
-    <w:bookmarkStart w:id="110" w:name="cierre-de-sesión-y-seguridad"/>
+    <w:bookmarkEnd w:id="130"/>
+    <w:bookmarkStart w:id="131" w:name="cierre-de-sesión-y-seguridad"/>
     <w:p>
       <w:pPr>
         <w:pStyle w:val="Heading1"/>
@@ -4872,7 +6338,7 @@
       <w:pPr>
         <w:numPr>
           <w:ilvl w:val="0"/>
-          <w:numId w:val="1018"/>
+          <w:numId w:val="1023"/>
         </w:numPr>
         <w:pStyle w:val="Compact"/>
       </w:pPr>
@@ -4884,7 +6350,7 @@
       <w:pPr>
         <w:numPr>
           <w:ilvl w:val="0"/>
-          <w:numId w:val="1018"/>
+          <w:numId w:val="1023"/>
         </w:numPr>
         <w:pStyle w:val="Compact"/>
       </w:pPr>
@@ -4896,7 +6362,7 @@
       <w:pPr>
         <w:numPr>
           <w:ilvl w:val="0"/>
-          <w:numId w:val="1018"/>
+          <w:numId w:val="1023"/>
         </w:numPr>
         <w:pStyle w:val="Compact"/>
       </w:pPr>
@@ -4908,7 +6374,7 @@
       <w:pPr>
         <w:numPr>
           <w:ilvl w:val="0"/>
-          <w:numId w:val="1018"/>
+          <w:numId w:val="1023"/>
         </w:numPr>
         <w:pStyle w:val="Compact"/>
       </w:pPr>
@@ -4920,7 +6386,7 @@
       <w:pPr>
         <w:numPr>
           <w:ilvl w:val="0"/>
-          <w:numId w:val="1018"/>
+          <w:numId w:val="1023"/>
         </w:numPr>
         <w:pStyle w:val="Compact"/>
       </w:pPr>
@@ -4950,7 +6416,7 @@
       <w:pPr>
         <w:numPr>
           <w:ilvl w:val="0"/>
-          <w:numId w:val="1019"/>
+          <w:numId w:val="1024"/>
         </w:numPr>
         <w:pStyle w:val="Compact"/>
       </w:pPr>
@@ -4962,7 +6428,7 @@
       <w:pPr>
         <w:numPr>
           <w:ilvl w:val="0"/>
-          <w:numId w:val="1019"/>
+          <w:numId w:val="1024"/>
         </w:numPr>
         <w:pStyle w:val="Compact"/>
       </w:pPr>
@@ -4970,7 +6436,7 @@
         <w:t xml:space="preserve">Equipo técnico: Emmanuel Artunduaga Charry (emmanuel_artunduagach@fet.edu.co) y Jawer Leonardo Manrique Yosa (jawer_manriqueyo@fet.edu.co).</w:t>
       </w:r>
     </w:p>
-    <w:bookmarkEnd w:id="110"/>
+    <w:bookmarkEnd w:id="131"/>
     <w:sectPr/>
   </w:body>
 </w:document>
@@ -5553,6 +7019,9 @@
     <w:abstractNumId w:val="991"/>
   </w:num>
   <w:num w:numId="1012">
+    <w:abstractNumId w:val="991"/>
+  </w:num>
+  <w:num w:numId="1013">
     <w:abstractNumId w:val="99411"/>
     <w:lvlOverride w:ilvl="0">
       <w:startOverride w:val="1"/>
@@ -5582,7 +7051,37 @@
       <w:startOverride w:val="1"/>
     </w:lvlOverride>
   </w:num>
-  <w:num w:numId="1013">
+  <w:num w:numId="1014">
+    <w:abstractNumId w:val="99411"/>
+    <w:lvlOverride w:ilvl="0">
+      <w:startOverride w:val="1"/>
+    </w:lvlOverride>
+    <w:lvlOverride w:ilvl="1">
+      <w:startOverride w:val="1"/>
+    </w:lvlOverride>
+    <w:lvlOverride w:ilvl="2">
+      <w:startOverride w:val="1"/>
+    </w:lvlOverride>
+    <w:lvlOverride w:ilvl="3">
+      <w:startOverride w:val="1"/>
+    </w:lvlOverride>
+    <w:lvlOverride w:ilvl="4">
+      <w:startOverride w:val="1"/>
+    </w:lvlOverride>
+    <w:lvlOverride w:ilvl="5">
+      <w:startOverride w:val="1"/>
+    </w:lvlOverride>
+    <w:lvlOverride w:ilvl="6">
+      <w:startOverride w:val="1"/>
+    </w:lvlOverride>
+    <w:lvlOverride w:ilvl="7">
+      <w:startOverride w:val="1"/>
+    </w:lvlOverride>
+    <w:lvlOverride w:ilvl="8">
+      <w:startOverride w:val="1"/>
+    </w:lvlOverride>
+  </w:num>
+  <w:num w:numId="1015">
     <w:abstractNumId w:val="99414"/>
     <w:lvlOverride w:ilvl="0">
       <w:startOverride w:val="4"/>
@@ -5612,7 +7111,7 @@
       <w:startOverride w:val="4"/>
     </w:lvlOverride>
   </w:num>
-  <w:num w:numId="1014">
+  <w:num w:numId="1016">
     <w:abstractNumId w:val="99416"/>
     <w:lvlOverride w:ilvl="0">
       <w:startOverride w:val="6"/>
@@ -5642,46 +7141,82 @@
       <w:startOverride w:val="6"/>
     </w:lvlOverride>
   </w:num>
-  <w:num w:numId="1015">
+  <w:num w:numId="1017">
     <w:abstractNumId w:val="991"/>
-  </w:num>
-  <w:num w:numId="1016">
-    <w:abstractNumId w:val="991"/>
-  </w:num>
-  <w:num w:numId="1017">
-    <w:abstractNumId w:val="99411"/>
-    <w:lvlOverride w:ilvl="0">
-      <w:startOverride w:val="1"/>
-    </w:lvlOverride>
-    <w:lvlOverride w:ilvl="1">
-      <w:startOverride w:val="1"/>
-    </w:lvlOverride>
-    <w:lvlOverride w:ilvl="2">
-      <w:startOverride w:val="1"/>
-    </w:lvlOverride>
-    <w:lvlOverride w:ilvl="3">
-      <w:startOverride w:val="1"/>
-    </w:lvlOverride>
-    <w:lvlOverride w:ilvl="4">
-      <w:startOverride w:val="1"/>
-    </w:lvlOverride>
-    <w:lvlOverride w:ilvl="5">
-      <w:startOverride w:val="1"/>
-    </w:lvlOverride>
-    <w:lvlOverride w:ilvl="6">
-      <w:startOverride w:val="1"/>
-    </w:lvlOverride>
-    <w:lvlOverride w:ilvl="7">
-      <w:startOverride w:val="1"/>
-    </w:lvlOverride>
-    <w:lvlOverride w:ilvl="8">
-      <w:startOverride w:val="1"/>
-    </w:lvlOverride>
   </w:num>
   <w:num w:numId="1018">
     <w:abstractNumId w:val="991"/>
   </w:num>
   <w:num w:numId="1019">
+    <w:abstractNumId w:val="991"/>
+  </w:num>
+  <w:num w:numId="1020">
+    <w:abstractNumId w:val="99411"/>
+    <w:lvlOverride w:ilvl="0">
+      <w:startOverride w:val="1"/>
+    </w:lvlOverride>
+    <w:lvlOverride w:ilvl="1">
+      <w:startOverride w:val="1"/>
+    </w:lvlOverride>
+    <w:lvlOverride w:ilvl="2">
+      <w:startOverride w:val="1"/>
+    </w:lvlOverride>
+    <w:lvlOverride w:ilvl="3">
+      <w:startOverride w:val="1"/>
+    </w:lvlOverride>
+    <w:lvlOverride w:ilvl="4">
+      <w:startOverride w:val="1"/>
+    </w:lvlOverride>
+    <w:lvlOverride w:ilvl="5">
+      <w:startOverride w:val="1"/>
+    </w:lvlOverride>
+    <w:lvlOverride w:ilvl="6">
+      <w:startOverride w:val="1"/>
+    </w:lvlOverride>
+    <w:lvlOverride w:ilvl="7">
+      <w:startOverride w:val="1"/>
+    </w:lvlOverride>
+    <w:lvlOverride w:ilvl="8">
+      <w:startOverride w:val="1"/>
+    </w:lvlOverride>
+  </w:num>
+  <w:num w:numId="1021">
+    <w:abstractNumId w:val="991"/>
+  </w:num>
+  <w:num w:numId="1022">
+    <w:abstractNumId w:val="99411"/>
+    <w:lvlOverride w:ilvl="0">
+      <w:startOverride w:val="1"/>
+    </w:lvlOverride>
+    <w:lvlOverride w:ilvl="1">
+      <w:startOverride w:val="1"/>
+    </w:lvlOverride>
+    <w:lvlOverride w:ilvl="2">
+      <w:startOverride w:val="1"/>
+    </w:lvlOverride>
+    <w:lvlOverride w:ilvl="3">
+      <w:startOverride w:val="1"/>
+    </w:lvlOverride>
+    <w:lvlOverride w:ilvl="4">
+      <w:startOverride w:val="1"/>
+    </w:lvlOverride>
+    <w:lvlOverride w:ilvl="5">
+      <w:startOverride w:val="1"/>
+    </w:lvlOverride>
+    <w:lvlOverride w:ilvl="6">
+      <w:startOverride w:val="1"/>
+    </w:lvlOverride>
+    <w:lvlOverride w:ilvl="7">
+      <w:startOverride w:val="1"/>
+    </w:lvlOverride>
+    <w:lvlOverride w:ilvl="8">
+      <w:startOverride w:val="1"/>
+    </w:lvlOverride>
+  </w:num>
+  <w:num w:numId="1023">
+    <w:abstractNumId w:val="991"/>
+  </w:num>
+  <w:num w:numId="1024">
     <w:abstractNumId w:val="991"/>
   </w:num>
 </w:numbering>

</xml_diff>